<commit_message>
Project-2: AI-use doc pointer
</commit_message>
<xml_diff>
--- a/Project-2/report/ECSE4320_Project2_Report.docx
+++ b/Project-2/report/ECSE4320_Project2_Report.docx
@@ -10315,7 +10315,7 @@
         <w:pStyle w:val="FirstParagraph"/>
       </w:pPr>
       <w:r>
-        <w:t xml:space="preserve">Predictions were written before the benchmarks existed (the first group, H1a to H8d) or before the corresponding new measurements were read (the second group, H7d to H13, Appendix D). Text is reproduced without change except that references to an unrelated earlier project were removed.</w:t>
+        <w:t xml:space="preserve">Predictions were written before the benchmarks existed (the first group, H1a to H8d) or before the corresponding new measurements were read (the second group, H7d to H13, Appendix D). Text is reproduced without change except that bracketed references to numbers from an earlier, separate pointer-chase exercise on the same machine were removed. Those numbers informed some of the predictions (L1, L2 and DRAM latency, the 2.6 ns step, the sequential-chase ratio, one-core read bandwidth, TLB onset and penalty), so those predictions were not blind.</w:t>
       </w:r>
     </w:p>
     <w:p>
@@ -10623,7 +10623,7 @@
               <w:pStyle w:val="Compact"/>
             </w:pPr>
             <w:r>
-              <w:t xml:space="preserve">L2 latency 12 to 40 cycles, i.e. 3 to 9 ns; the plateau sits near 16 MB capacity (one active core can use the whole 16 MB L2).6 ns step between 128 KB and 1 MB; I predict that step recurs.</w:t>
+              <w:t xml:space="preserve">L2 latency 12 to 40 cycles, i.e. 3 to 9 ns; the plateau sits near 16 MB capacity (one active core can use the whole 16 MB L2). An unexplained 2.6 ns step between 128 KB and 1 MB is predicted.</w:t>
             </w:r>
           </w:p>
         </w:tc>
@@ -10823,7 +10823,7 @@
               <w:pStyle w:val="Compact"/>
             </w:pPr>
             <w:r>
-              <w:t xml:space="preserve">Sequential pointer-chase at 128 B stride in a DRAM-resident footprint is at least 5x faster per node than the random chase (prefetcher;</w:t>
+              <w:t xml:space="preserve">Sequential pointer-chase at 128 B stride in a DRAM-resident footprint is at least 5x faster per node than the random chase (prefetcher).</w:t>
             </w:r>
           </w:p>
         </w:tc>
@@ -11886,7 +11886,7 @@
               <w:pStyle w:val="Compact"/>
             </w:pPr>
             <w:r>
-              <w:t xml:space="preserve">Holding the number of lines fixed (cache footprint identical), touching one line per page instead of packed lines adds latency once the number of distinct 16 KB pages exceeds the L1 DTLB reach. Onset between 128 and 512 pages (2 to 8 MB reach);3 ns at 256 pages.</w:t>
+              <w:t xml:space="preserve">Holding the number of lines fixed (cache footprint identical), touching one line per page instead of packed lines adds latency once the number of distinct 16 KB pages exceeds the L1 DTLB reach. Onset between 128 and 512 pages (2 to 8 MB reach).</w:t>
             </w:r>
           </w:p>
         </w:tc>

</xml_diff>